<commit_message>
fix: contrato de venta toma NIT y fecha de cláusula octava de marcadores
- config.py: RAZON_SOCIAL y NIT como fuente única de los datos legales.
- contrato.docx: los dos NIT escritos a mano pasan a {{ nit }} y la
  fecha fija de la cláusula octava (20/12/2025) pasa a {{ fecha }}.
- generar_contrato pasa el NIT desde config.

Co-Authored-By: Claude Opus 5.5 <noreply@anthropic.com>
</commit_message>
<xml_diff>
--- a/app/plantillas/contrato.docx
+++ b/app/plantillas/contrato.docx
@@ -102,7 +102,7 @@
         <w:rPr>
           <w:rtl w:val="0"/>
         </w:rPr>
-        <w:t xml:space="preserve">NIT: 1.123.456.789</w:t>
+        <w:t>NIT: {{ nit }}</w:t>
       </w:r>
     </w:p>
     <w:p>
@@ -593,7 +593,7 @@
         <w:rPr>
           <w:rtl w:val="0"/>
         </w:rPr>
-        <w:t xml:space="preserve">SE le informa al comprador que a partir de la fecha 20/12/2025 la moto queda bajo su responsabilidad, esto quiere decir que si le hacen comparendo o presenta algún problema legar él se hace responsable</w:t>
+        <w:t>SE le informa al comprador que a partir de la fecha {{ fecha }} la moto queda bajo su responsabilidad, esto quiere decir que si le hacen comparendo o presenta algún problema legar él se hace responsable</w:t>
       </w:r>
       <w:r>
         <w:rPr>
@@ -685,7 +685,7 @@
           </w:p>
           <w:p>
             <w:r>
-              <w:t>NIT 1.00.123.456.789</w:t>
+              <w:t>NIT {{ nit }}</w:t>
             </w:r>
           </w:p>
         </w:tc>

</xml_diff>